<commit_message>
docs: CONSORT-style data-flow diagram (Lim 2024 format) embedded in final report
</commit_message>
<xml_diff>
--- a/docs/FINAL_REPORT.docx
+++ b/docs/FINAL_REPORT.docx
@@ -2,7 +2,7 @@
 <file path=word/document.xml><?xml version="1.0" encoding="utf-8"?>
 <w:document xmlns:w="http://schemas.openxmlformats.org/wordprocessingml/2006/main" xmlns:m="http://schemas.openxmlformats.org/officeDocument/2006/math" xmlns:r="http://schemas.openxmlformats.org/officeDocument/2006/relationships" xmlns:o="urn:schemas-microsoft-com:office:office" xmlns:v="urn:schemas-microsoft-com:vml" xmlns:w10="urn:schemas-microsoft-com:office:word" xmlns:a="http://schemas.openxmlformats.org/drawingml/2006/main" xmlns:pic="http://schemas.openxmlformats.org/drawingml/2006/picture" xmlns:wp="http://schemas.openxmlformats.org/drawingml/2006/wordprocessingDrawing">
   <w:body>
-    <w:bookmarkStart w:id="37" w:name="X6e410fc210dc9a90669ea74bfcd6cb3ea924af7"/>
+    <w:bookmarkStart w:id="40" w:name="X6e410fc210dc9a90669ea74bfcd6cb3ea924af7"/>
     <w:p>
       <w:pPr>
         <w:pStyle w:val="Heading1"/>
@@ -1415,7 +1415,7 @@
       </w:r>
     </w:p>
     <w:bookmarkEnd w:id="11"/>
-    <w:bookmarkStart w:id="12" w:name="data-preparation-and-cohort-construction"/>
+    <w:bookmarkStart w:id="15" w:name="data-preparation-and-cohort-construction"/>
     <w:p>
       <w:pPr>
         <w:pStyle w:val="Heading2"/>
@@ -1446,124 +1446,69 @@
     </w:p>
     <w:p>
       <w:pPr>
-        <w:pStyle w:val="SourceCode"/>
-      </w:pPr>
-      <w:r>
-        <w:rPr>
-          <w:rStyle w:val="VerbatimChar"/>
-        </w:rPr>
-        <w:t xml:space="preserve">457,670   Full 2024 BRFSS file (all states and territories)</w:t>
-      </w:r>
-      <w:r>
-        <w:br/>
-      </w:r>
-      <w:r>
-        <w:rPr>
-          <w:rStyle w:val="VerbatimChar"/>
-        </w:rPr>
-        <w:t xml:space="preserve">   │  exclude 361,383 never asked CAREGIV1 (state did not field the module)</w:t>
-      </w:r>
-      <w:r>
-        <w:br/>
-      </w:r>
-      <w:r>
-        <w:rPr>
-          <w:rStyle w:val="VerbatimChar"/>
-        </w:rPr>
-        <w:t xml:space="preserve">   ▼</w:t>
-      </w:r>
-      <w:r>
-        <w:br/>
-      </w:r>
-      <w:r>
-        <w:rPr>
-          <w:rStyle w:val="VerbatimChar"/>
-        </w:rPr>
-        <w:t xml:space="preserve"> 96,287   Caregiver-module sample (16 states; 21.0% of file)</w:t>
-      </w:r>
-      <w:r>
-        <w:br/>
-      </w:r>
-      <w:r>
-        <w:rPr>
-          <w:rStyle w:val="VerbatimChar"/>
-        </w:rPr>
-        <w:t xml:space="preserve">   │  exclude 1,617 with invalid CAREGIV1 (n = 558) and/or invalid CHECKUP1 (overlapping)</w:t>
-      </w:r>
-      <w:r>
-        <w:br/>
-      </w:r>
-      <w:r>
-        <w:rPr>
-          <w:rStyle w:val="VerbatimChar"/>
-        </w:rPr>
-        <w:t xml:space="preserve">   ▼</w:t>
-      </w:r>
-      <w:r>
-        <w:br/>
-      </w:r>
-      <w:r>
-        <w:rPr>
-          <w:rStyle w:val="VerbatimChar"/>
-        </w:rPr>
-        <w:t xml:space="preserve"> 94,670   Valid caregiver status + valid primary outcome</w:t>
-      </w:r>
-      <w:r>
-        <w:br/>
-      </w:r>
-      <w:r>
-        <w:rPr>
-          <w:rStyle w:val="VerbatimChar"/>
-        </w:rPr>
-        <w:t xml:space="preserve">   │  exclude 7,994 with an invalid value on any complete-case predictor (§5)</w:t>
-      </w:r>
-      <w:r>
-        <w:br/>
-      </w:r>
-      <w:r>
-        <w:rPr>
-          <w:rStyle w:val="VerbatimChar"/>
-        </w:rPr>
-        <w:t xml:space="preserve">   ▼</w:t>
-      </w:r>
-      <w:r>
-        <w:br/>
-      </w:r>
-      <w:r>
-        <w:rPr>
-          <w:rStyle w:val="VerbatimChar"/>
-        </w:rPr>
-        <w:t xml:space="preserve"> 86,676   MAIN ANALYTIC SAMPLE (90.0% within-module retention)</w:t>
-      </w:r>
-      <w:r>
-        <w:br/>
-      </w:r>
-      <w:r>
-        <w:rPr>
-          <w:rStyle w:val="VerbatimChar"/>
-        </w:rPr>
-        <w:t xml:space="preserve">   │</w:t>
-      </w:r>
-      <w:r>
-        <w:br/>
-      </w:r>
-      <w:r>
-        <w:rPr>
-          <w:rStyle w:val="VerbatimChar"/>
-        </w:rPr>
-        <w:t xml:space="preserve">   └────►  19,263   Caregivers-only subset (22.2%) for RQ3</w:t>
-      </w:r>
-    </w:p>
-    <w:p>
-      <w:pPr>
-        <w:pStyle w:val="FirstParagraph"/>
+        <w:pStyle w:val="CaptionedFigure"/>
+      </w:pPr>
+      <w:r>
+        <w:drawing>
+          <wp:inline>
+            <wp:extent cx="5334000" cy="6277536"/>
+            <wp:effectExtent b="0" l="0" r="0" t="0"/>
+            <wp:docPr descr="Figure 1. CONSORT-style cohort cascade from the full 2024 BRFSS file to the main analytic sample (n = 86,676) and the caregivers-only subset (n = 19,263). Exclusion reasons and counts shown at right; format follows Lim et al. (2024)." title="" id="13" name="Picture"/>
+            <a:graphic>
+              <a:graphicData uri="http://schemas.openxmlformats.org/drawingml/2006/picture">
+                <pic:pic>
+                  <pic:nvPicPr>
+                    <pic:cNvPr descr="results/data_flow_diagram.png" id="14" name="Picture"/>
+                    <pic:cNvPicPr>
+                      <a:picLocks noChangeArrowheads="1" noChangeAspect="1"/>
+                    </pic:cNvPicPr>
+                  </pic:nvPicPr>
+                  <pic:blipFill>
+                    <a:blip r:embed="rId12"/>
+                    <a:stretch>
+                      <a:fillRect/>
+                    </a:stretch>
+                  </pic:blipFill>
+                  <pic:spPr bwMode="auto">
+                    <a:xfrm>
+                      <a:off x="0" y="0"/>
+                      <a:ext cx="5334000" cy="6277536"/>
+                    </a:xfrm>
+                    <a:prstGeom prst="rect">
+                      <a:avLst/>
+                    </a:prstGeom>
+                    <a:noFill/>
+                    <a:ln w="9525">
+                      <a:noFill/>
+                      <a:headEnd/>
+                      <a:tailEnd/>
+                    </a:ln>
+                  </pic:spPr>
+                </pic:pic>
+              </a:graphicData>
+            </a:graphic>
+          </wp:inline>
+        </w:drawing>
+      </w:r>
+    </w:p>
+    <w:p>
+      <w:pPr>
+        <w:pStyle w:val="ImageCaption"/>
+      </w:pPr>
+      <w:r>
+        <w:t xml:space="preserve">Figure 1. CONSORT-style cohort cascade from the full 2024 BRFSS file to the main analytic sample (n = 86,676) and the caregivers-only subset (n = 19,263). Exclusion reasons and counts shown at right; format follows Lim et al. (2024).</w:t>
+      </w:r>
+    </w:p>
+    <w:p>
+      <w:pPr>
+        <w:pStyle w:val="BodyText"/>
       </w:pPr>
       <w:r>
         <w:t xml:space="preserve">All recodes are codebook-driven fixed mappings (CDC, 2025), so applying them before the stratified train/test split introduces no leakage; the full leakage-prevention design (intensity-item quarantine, no target-derived features, split-before-fit, single test-set evaluation) is described with the modelling methods (§8).</w:t>
       </w:r>
     </w:p>
-    <w:bookmarkEnd w:id="12"/>
-    <w:bookmarkStart w:id="13" w:name="missing-data-strategy"/>
+    <w:bookmarkEnd w:id="15"/>
+    <w:bookmarkStart w:id="16" w:name="missing-data-strategy"/>
     <w:p>
       <w:pPr>
         <w:pStyle w:val="Heading2"/>
@@ -1721,8 +1666,8 @@
         <w:t xml:space="preserve">) is a valid substantive value — the most severe form of the gap — not missing data. Because codes 2/3/4/8 form an ordinal gradient, we pre-specified a robustness threshold (gap = more than two years, codes 3/4/8; event rate 9.4%) to confirm findings are not artefacts of the one-year cut (§9.6).</w:t>
       </w:r>
     </w:p>
-    <w:bookmarkEnd w:id="13"/>
-    <w:bookmarkStart w:id="14" w:name="data-validation"/>
+    <w:bookmarkEnd w:id="16"/>
+    <w:bookmarkStart w:id="17" w:name="data-validation"/>
     <w:p>
       <w:pPr>
         <w:pStyle w:val="Heading2"/>
@@ -1803,8 +1748,8 @@
         <w:t xml:space="preserve">caregivers in our sample skew female (60.0%) and older, matching the published profile from the same BRFSS module (Edwards et al., 2020).</w:t>
       </w:r>
     </w:p>
-    <w:bookmarkEnd w:id="14"/>
-    <w:bookmarkStart w:id="15" w:name="outcome-justification-and-limitations"/>
+    <w:bookmarkEnd w:id="17"/>
+    <w:bookmarkStart w:id="18" w:name="outcome-justification-and-limitations"/>
     <w:p>
       <w:pPr>
         <w:pStyle w:val="Heading2"/>
@@ -1833,8 +1778,8 @@
         <w:t xml:space="preserve">denotes deviation from the annual-visit norm, not clinical harm per se; and (iv) the item carries no information on visit quality or content. As a companion indicator, 31.7% of the analytic sample reported no dental visit within the past year (caregivers 31.2% vs non-caregivers 31.8%), a similar caregiver-neutral pattern that supports the check-up measure not being idiosyncratic.</w:t>
       </w:r>
     </w:p>
-    <w:bookmarkEnd w:id="15"/>
-    <w:bookmarkStart w:id="20" w:name="methods"/>
+    <w:bookmarkEnd w:id="18"/>
+    <w:bookmarkStart w:id="23" w:name="methods"/>
     <w:p>
       <w:pPr>
         <w:pStyle w:val="Heading2"/>
@@ -1843,7 +1788,7 @@
         <w:t xml:space="preserve">8. Methods</w:t>
       </w:r>
     </w:p>
-    <w:bookmarkStart w:id="16" w:name="model-line-up"/>
+    <w:bookmarkStart w:id="19" w:name="model-line-up"/>
     <w:p>
       <w:pPr>
         <w:pStyle w:val="Heading3"/>
@@ -1917,8 +1862,8 @@
         <w:t xml:space="preserve">to capture non-linearity and interactions the linear baseline cannot. A majority-class dummy classifier anchors the comparison floor. The 19 predictors were encoded into 38 model features (one-hot for nominal variables; ordered integers for ordinal bands).</w:t>
       </w:r>
     </w:p>
-    <w:bookmarkEnd w:id="16"/>
-    <w:bookmarkStart w:id="17" w:name="validation-design"/>
+    <w:bookmarkEnd w:id="19"/>
+    <w:bookmarkStart w:id="20" w:name="validation-design"/>
     <w:p>
       <w:pPr>
         <w:pStyle w:val="Heading3"/>
@@ -1967,8 +1912,8 @@
         <w:t xml:space="preserve">with a leave-one-region-out design: for each Census region, we trained on the other three regions and evaluated on the held-out region — an adaptation of the leave-site-out logic recommended for health prediction models (Simon &amp; Aliferis, 2024). We present this honestly as a transportability probe within the 16 module states, not as external validation.</w:t>
       </w:r>
     </w:p>
-    <w:bookmarkEnd w:id="17"/>
-    <w:bookmarkStart w:id="18" w:name="class-imbalance"/>
+    <w:bookmarkEnd w:id="20"/>
+    <w:bookmarkStart w:id="21" w:name="class-imbalance"/>
     <w:p>
       <w:pPr>
         <w:pStyle w:val="Heading3"/>
@@ -2013,8 +1958,8 @@
         <w:t xml:space="preserve">in all three models and emphasised threshold-aware metrics over accuracy. One known consequence, assessed explicitly below, is that class weighting inflates the mean predicted probability, which degrades calibration even when discrimination is good.</w:t>
       </w:r>
     </w:p>
-    <w:bookmarkEnd w:id="18"/>
-    <w:bookmarkStart w:id="19" w:name="evaluation-metrics"/>
+    <w:bookmarkEnd w:id="21"/>
+    <w:bookmarkStart w:id="22" w:name="evaluation-metrics"/>
     <w:p>
       <w:pPr>
         <w:pStyle w:val="Heading3"/>
@@ -2063,9 +2008,9 @@
         <w:t xml:space="preserve">(predicted versus observed event fraction) for the logistic and forest models.</w:t>
       </w:r>
     </w:p>
-    <w:bookmarkEnd w:id="19"/>
-    <w:bookmarkEnd w:id="20"/>
-    <w:bookmarkStart w:id="31" w:name="results"/>
+    <w:bookmarkEnd w:id="22"/>
+    <w:bookmarkEnd w:id="23"/>
+    <w:bookmarkStart w:id="34" w:name="results"/>
     <w:p>
       <w:pPr>
         <w:pStyle w:val="Heading2"/>
@@ -2074,7 +2019,7 @@
         <w:t xml:space="preserve">9. Results</w:t>
       </w:r>
     </w:p>
-    <w:bookmarkStart w:id="21" w:name="descriptive-highlights"/>
+    <w:bookmarkStart w:id="24" w:name="descriptive-highlights"/>
     <w:p>
       <w:pPr>
         <w:pStyle w:val="Heading3"/>
@@ -2551,8 +2496,8 @@
         </w:tc>
       </w:tr>
     </w:tbl>
-    <w:bookmarkEnd w:id="21"/>
-    <w:bookmarkStart w:id="22" w:name="model-comparison"/>
+    <w:bookmarkEnd w:id="24"/>
+    <w:bookmarkStart w:id="25" w:name="model-comparison"/>
     <w:p>
       <w:pPr>
         <w:pStyle w:val="Heading3"/>
@@ -3034,8 +2979,8 @@
         <w:t xml:space="preserve">The dummy’s 81.8% accuracy — highest in the table while detecting zero gaps — illustrates why accuracy alone is misleading here. The logistic baseline and the forest are effectively tied on discrimination (AUROC 0.814 vs 0.813); the forest leads on AUPRC (0.553, three times the 0.182 baseline). Five-fold CV AUROCs for the logistic model (0.795, 0.804, 0.806, 0.822, 0.823; mean 0.810) bracket the test-set value, indicating no overfitting.</w:t>
       </w:r>
     </w:p>
-    <w:bookmarkEnd w:id="22"/>
-    <w:bookmarkStart w:id="26" w:name="calibration"/>
+    <w:bookmarkEnd w:id="25"/>
+    <w:bookmarkStart w:id="29" w:name="calibration"/>
     <w:p>
       <w:pPr>
         <w:pStyle w:val="Heading3"/>
@@ -3101,18 +3046,18 @@
           <wp:inline>
             <wp:extent cx="5334000" cy="4083843"/>
             <wp:effectExtent b="0" l="0" r="0" t="0"/>
-            <wp:docPr descr="Figure 2. Reliability curves for the logistic regression and random forest models. Both curves lie below the perfect-calibration diagonal, showing systematic over-prediction of risk." title="" id="24" name="Picture"/>
+            <wp:docPr descr="Figure 2. Reliability curves for the logistic regression and random forest models. Both curves lie below the perfect-calibration diagonal, showing systematic over-prediction of risk." title="" id="27" name="Picture"/>
             <a:graphic>
               <a:graphicData uri="http://schemas.openxmlformats.org/drawingml/2006/picture">
                 <pic:pic>
                   <pic:nvPicPr>
-                    <pic:cNvPr descr="results/calibration_plot.png" id="25" name="Picture"/>
+                    <pic:cNvPr descr="results/calibration_plot.png" id="28" name="Picture"/>
                     <pic:cNvPicPr>
                       <a:picLocks noChangeArrowheads="1" noChangeAspect="1"/>
                     </pic:cNvPicPr>
                   </pic:nvPicPr>
                   <pic:blipFill>
-                    <a:blip r:embed="rId23"/>
+                    <a:blip r:embed="rId26"/>
                     <a:stretch>
                       <a:fillRect/>
                     </a:stretch>
@@ -3147,8 +3092,8 @@
         <w:t xml:space="preserve">Figure 2. Reliability curves for the logistic regression and random forest models. Both curves lie below the perfect-calibration diagonal, showing systematic over-prediction of risk.</w:t>
       </w:r>
     </w:p>
-    <w:bookmarkEnd w:id="26"/>
-    <w:bookmarkStart w:id="27" w:name="what-predicts-the-gap"/>
+    <w:bookmarkEnd w:id="29"/>
+    <w:bookmarkStart w:id="30" w:name="what-predicts-the-gap"/>
     <w:p>
       <w:pPr>
         <w:pStyle w:val="Heading3"/>
@@ -3165,8 +3110,8 @@
         <w:t xml:space="preserve">Permutation importance for the forest and the logistic odds ratios converge on the same access-dominated story. The forest’s top five — personal doctor (0.079), age band (0.028), diabetes (0.018), sex (0.006), uninsured status (0.005) — mirror the odds-ratio extremes: having a personal doctor OR 0.142, uninsured OR 1.841, cost barrier OR 1.758, diabetes OR 0.37, female OR 0.73. The tree tells the same story structurally: it splits first on personal doctor; among those without one, next on diabetes and then uninsured status; among those with one, on age band and then diabetes.</w:t>
       </w:r>
     </w:p>
-    <w:bookmarkEnd w:id="27"/>
-    <w:bookmarkStart w:id="28" w:name="the-caregiver-estimate"/>
+    <w:bookmarkEnd w:id="30"/>
+    <w:bookmarkStart w:id="31" w:name="the-caregiver-estimate"/>
     <w:p>
       <w:pPr>
         <w:pStyle w:val="Heading3"/>
@@ -3211,8 +3156,8 @@
         <w:t xml:space="preserve">advantage is therefore largely compositional: caregivers in these states skew older and female (Edwards et al., 2020), profiles already associated with higher attendance, and the raw advantage narrows within age strata (under 65: 20.5% vs 26.3%; 65+: 7.0% vs 7.3%). Caregiving status, per se, is not meaningfully associated with the check-up gap once who caregivers are is accounted for.</w:t>
       </w:r>
     </w:p>
-    <w:bookmarkEnd w:id="28"/>
-    <w:bookmarkStart w:id="29" w:name="robustness-and-transportability"/>
+    <w:bookmarkEnd w:id="31"/>
+    <w:bookmarkStart w:id="32" w:name="robustness-and-transportability"/>
     <w:p>
       <w:pPr>
         <w:pStyle w:val="Heading3"/>
@@ -3229,8 +3174,8 @@
         <w:t xml:space="preserve">Under the alternative more-than-two-years gap threshold, the event rate falls to 9.4% (caregivers 9.1% vs non-caregivers 9.5%) and the caregiver OR is 0.934 — the same attenuated, near-null conclusion, so the finding is not an artefact of the one-year cut-point. Leave-region-out AUROCs (Northeast 0.771, West 0.802, Midwest 0.807, South 0.826) closely bracket the internal CV range (0.795–0.823), with modest degradation in the Northeast (0.771) and marginally stronger performance in the South (0.826) — the model transports reasonably across the module footprint rather than perfectly.</w:t>
       </w:r>
     </w:p>
-    <w:bookmarkEnd w:id="29"/>
-    <w:bookmarkStart w:id="30" w:name="within-caregivers-rq3"/>
+    <w:bookmarkEnd w:id="32"/>
+    <w:bookmarkStart w:id="33" w:name="within-caregivers-rq3"/>
     <w:p>
       <w:pPr>
         <w:pStyle w:val="Heading3"/>
@@ -3263,9 +3208,9 @@
         <w:t xml:space="preserve">(0–8 h/week: 14.8%; 9–19 h: 16.2%; 20–39 h: 15.3%). By care relationship, respondents caring for a father show the highest gap rate (28.6%, n = 829), against 16.8% for the most common group, caring for a mother (n = 6,051), and 10.7% for mother-in-law (n = 4,307) — suggesting that who is cared for differentiates risk more than caregiving intensity does.</w:t>
       </w:r>
     </w:p>
-    <w:bookmarkEnd w:id="30"/>
-    <w:bookmarkEnd w:id="31"/>
-    <w:bookmarkStart w:id="32" w:name="discussion-and-interpretation"/>
+    <w:bookmarkEnd w:id="33"/>
+    <w:bookmarkEnd w:id="34"/>
+    <w:bookmarkStart w:id="35" w:name="discussion-and-interpretation"/>
     <w:p>
       <w:pPr>
         <w:pStyle w:val="Heading2"/>
@@ -3376,8 +3321,8 @@
         <w:t xml:space="preserve">Longitudinal follow-up to establish whether gaps precede or follow caregiving onset; visit content and quality; care-recipient characteristics for all respondents; a broader preventive-care bundle (screenings, vaccinations, dental); linkage to claims data; and caregiver-module fielding in all states with design weights, enabling representative estimation.</w:t>
       </w:r>
     </w:p>
-    <w:bookmarkEnd w:id="32"/>
-    <w:bookmarkStart w:id="33" w:name="limitations"/>
+    <w:bookmarkEnd w:id="35"/>
+    <w:bookmarkStart w:id="36" w:name="limitations"/>
     <w:p>
       <w:pPr>
         <w:pStyle w:val="Heading2"/>
@@ -3402,8 +3347,8 @@
         <w:t xml:space="preserve">The design is cross-sectional: predictors and outcome refer to overlapping 2024 reference periods, there is no prediction horizon, and no association reported here should be read causally. All measures are self-reported and subject to recall and social-desirability bias, and the outcome captures one indicator of preventive engagement, not its totality (§7). Finally, a calibration caveat: with balanced class weights, predicted probabilities systematically over-state observed risk (§9.3); discrimination is honest, and the scores are suitable for ranking outreach lists, but they would require recalibration (Platt scaling or isotonic regression) before use as literal probabilities.</w:t>
       </w:r>
     </w:p>
-    <w:bookmarkEnd w:id="33"/>
-    <w:bookmarkStart w:id="34" w:name="conclusion-and-learning-points"/>
+    <w:bookmarkEnd w:id="36"/>
+    <w:bookmarkStart w:id="37" w:name="conclusion-and-learning-points"/>
     <w:p>
       <w:pPr>
         <w:pStyle w:val="Heading2"/>
@@ -3420,8 +3365,8 @@
         <w:t xml:space="preserve">Demographic, socioeconomic, health, and access variables predict the routine check-up gap well (AUROC of approximately 0.81), access measures dominate, and caregiver status adds essentially nothing after adjustment. Four course lessons shaped the work. First, the five-element framing checklist converted a vague concern into three answerable research questions before any code was written. Second, codebook-driven preparation mattered: the same digit means different things across BRFSS items, and structural missingness had to be separated from item non-response (CDC, 2025). Third, leakage discipline — quarantining skip-logic variables, one declared role per variable, splitting before fitting — protected the headline null from being an artefact. Fourth, evaluating fewer models well (three models, full metric battery including calibration, plus a geographic hold-out modelled on published validation practice; Lim et al., 2024; Simon &amp; Aliferis, 2024) produced conclusions we can defend, including knowing precisely what the model can and cannot be used for.</w:t>
       </w:r>
     </w:p>
-    <w:bookmarkEnd w:id="34"/>
-    <w:bookmarkStart w:id="35" w:name="references"/>
+    <w:bookmarkEnd w:id="37"/>
+    <w:bookmarkStart w:id="38" w:name="references"/>
     <w:p>
       <w:pPr>
         <w:pStyle w:val="Heading2"/>
@@ -3640,8 +3585,8 @@
         <w:t xml:space="preserve">, Article 15. https://doi.org/10.1186/1472-6963-6-15</w:t>
       </w:r>
     </w:p>
-    <w:bookmarkEnd w:id="35"/>
-    <w:bookmarkStart w:id="36" w:name="Xdbd7287851139e10394b75f59053b293e5f15aa"/>
+    <w:bookmarkEnd w:id="38"/>
+    <w:bookmarkStart w:id="39" w:name="Xdbd7287851139e10394b75f59053b293e5f15aa"/>
     <w:p>
       <w:pPr>
         <w:pStyle w:val="Heading2"/>
@@ -6848,8 +6793,8 @@
         <w:t xml:space="preserve">The 361,383 respondents (79.0% of the full 2024 file) who were never asked CAREGIV1 reflect a sampling-frame restriction (their state did not field the Caregiver module), not non-response; they are excluded by design and do not appear in Table A2, which measures item-level invalidity within the 96,287-respondent module sample only. Among the caregivers, the descriptive-only detail items are nearly complete: CRGVREL5 99.9% valid, CRGVHRS2 98.7%, CRGVLNG2 98.5%.</w:t>
       </w:r>
     </w:p>
-    <w:bookmarkEnd w:id="36"/>
-    <w:bookmarkEnd w:id="37"/>
+    <w:bookmarkEnd w:id="39"/>
+    <w:bookmarkEnd w:id="40"/>
     <w:sectPr>
       <w:footnotePr>
         <w:numRestart w:val="eachSect"/>

</xml_diff>

<commit_message>
docs: name confounding explicitly (adjustment set, compositional confounding, unmeasured-confounder limitation)
</commit_message>
<xml_diff>
--- a/docs/FINAL_REPORT.docx
+++ b/docs/FINAL_REPORT.docx
@@ -317,7 +317,7 @@
         <w:t xml:space="preserve"> </w:t>
       </w:r>
       <w:r>
-        <w:t xml:space="preserve">cross-sectional — all predictors and outcomes refer to the 2024 survey reference periods (check-up: past 12 months; caregiving: past 30 days). There is no longitudinal prediction horizon; the models estimate current-state association, not future risk.</w:t>
+        <w:t xml:space="preserve">cross-sectional — all predictors and outcomes refer to the 2024 survey reference periods (check-up: past 12 months; caregiving: past 30 days). Relatedly, adjustment addresses only measured confounders; unmeasured factors such as health literacy, transport access, or care-seeking attitudes could still influence both caregiver status and check-up attendance. There is no longitudinal prediction horizon; the models estimate current-state association, not future risk.</w:t>
       </w:r>
     </w:p>
     <w:p>
@@ -441,7 +441,7 @@
         <w:t xml:space="preserve"> </w:t>
       </w:r>
       <w:r>
-        <w:t xml:space="preserve">unadjusted check-up gap rate than non-caregivers (15.0% versus 19.1%), but caregivers in the module states skew female and older — the profile with higher baseline attendance — so the unadjusted contrast cannot be taken at face value. Persistence of the difference after adjustment would support a</w:t>
+        <w:t xml:space="preserve">unadjusted check-up gap rate than non-caregivers (15.0% versus 19.1%), but caregivers in the module states skew female and older — the profile with higher baseline attendance — so age and sex act as classic confounders (associated with both caregiver status and check-up attendance), and the unadjusted contrast cannot be taken at face value. The demographic, socioeconomic, health-status, and access variables in our predictor set therefore double as the confounder-adjustment set for RQ2, per the framing checklist’s requirement to identify confounders that must be included. Persistence of the difference after adjustment would support a</w:t>
       </w:r>
       <w:r>
         <w:t xml:space="preserve"> </w:t>
@@ -3153,7 +3153,7 @@
         <w:t xml:space="preserve"> </w:t>
       </w:r>
       <w:r>
-        <w:t xml:space="preserve">advantage is therefore largely compositional: caregivers in these states skew older and female (Edwards et al., 2020), profiles already associated with higher attendance, and the raw advantage narrows within age strata (under 65: 20.5% vs 26.3%; 65+: 7.0% vs 7.3%). Caregiving status, per se, is not meaningfully associated with the check-up gap once who caregivers are is accounted for.</w:t>
+        <w:t xml:space="preserve">advantage is therefore largely compositional — a confounding effect of age and sex rather than an effect of caregiving: caregivers in these states skew older and female (Edwards et al., 2020), profiles already associated with higher attendance, and the raw advantage narrows within age strata (under 65: 20.5% vs 26.3%; 65+: 7.0% vs 7.3%). Caregiving status, per se, is not meaningfully associated with the check-up gap once who caregivers are is accounted for.</w:t>
       </w:r>
     </w:p>
     <w:bookmarkEnd w:id="31"/>

</xml_diff>